<commit_message>
docs(convenios): registra conferencia no Compass
</commit_message>
<xml_diff>
--- a/docs/aula-07-mongoose/atividade-aula7-mongoose-2026-10-29.docx
+++ b/docs/aula-07-mongoose/atividade-aula7-mongoose-2026-10-29.docx
@@ -585,7 +585,7 @@
                 <w:color w:val="000000"/>
                 <w:sz w:val="20"/>
               </w:rPr>
-              <w:t>Atlas com 5 documentos e 4 índices prontos</w:t>
+              <w:t>Atlas e Compass com 5 documentos e 4 índices prontos</w:t>
             </w:r>
           </w:p>
         </w:tc>
@@ -644,7 +644,7 @@
                 <w:color w:val="000000"/>
                 <w:sz w:val="20"/>
               </w:rPr>
-              <w:t>Conferência pendente por falta de janela controlável neste PC</w:t>
+              <w:t>Filtros de ativos, inativo e ANS com zero inicial conferidos</w:t>
             </w:r>
           </w:p>
         </w:tc>
@@ -2313,12 +2313,17 @@
         <w:pageBreakBefore/>
       </w:pPr>
       <w:r>
-        <w:t>Parte 3 Evidência no Atlas</w:t>
+        <w:t>Parte 3 Evidências no Atlas e Compass</w:t>
       </w:r>
     </w:p>
     <w:p>
       <w:r>
         <w:t>O Data Explorer do projeto clinora mostrou a coleção convenios com 5 documentos e 4 índices. Os identificadores dos exemplos na interface coincidem com os obtidos pelo verificador conectado pelo NestJS. Os quatro índices foram conferidos com status Ready.</w:t>
+      </w:r>
+    </w:p>
+    <w:p>
+      <w:r>
+        <w:t>O Compass 1.53.2 aberto neste PC também conectou ao Atlas e mostrou os mesmos cinco registros. O filtro de ativos retornou quatro documentos; o de inativos retornou Horizonte Saúde. A busca pelo ANS 045678 retornou Proteção Familiar, preservando o zero inicial como texto. As datas aparecem como ISODate.</w:t>
       </w:r>
     </w:p>
     <w:p>
@@ -2328,8 +2333,8 @@
       <w:r>
         <w:drawing>
           <wp:inline xmlns:a="http://schemas.openxmlformats.org/drawingml/2006/main" xmlns:pic="http://schemas.openxmlformats.org/drawingml/2006/picture">
-            <wp:extent cx="4663440" cy="5103960"/>
-            <wp:docPr id="1" name="Picture 1" descr="Coleção de Convênios no MongoDB Atlas com cinco documentos"/>
+            <wp:extent cx="6492240" cy="3813848"/>
+            <wp:docPr id="1" name="Picture 1" descr="MongoDB Compass com os quatro índices prontos e o índice composto expandido"/>
             <wp:cNvGraphicFramePr>
               <a:graphicFrameLocks noChangeAspect="1"/>
             </wp:cNvGraphicFramePr>
@@ -2337,7 +2342,7 @@
               <a:graphicData uri="http://schemas.openxmlformats.org/drawingml/2006/picture">
                 <pic:pic>
                   <pic:nvPicPr>
-                    <pic:cNvPr id="0" name="atlas-convenios.png"/>
+                    <pic:cNvPr id="0" name="compass-indices.png"/>
                     <pic:cNvPicPr/>
                   </pic:nvPicPr>
                   <pic:blipFill>
@@ -2349,7 +2354,7 @@
                   <pic:spPr>
                     <a:xfrm>
                       <a:off x="0" y="0"/>
-                      <a:ext cx="4663440" cy="5103960"/>
+                      <a:ext cx="6492240" cy="3813848"/>
                     </a:xfrm>
                     <a:prstGeom prst="rect"/>
                   </pic:spPr>
@@ -2362,7 +2367,7 @@
     </w:p>
     <w:p>
       <w:r>
-        <w:t>A captura dos índices está em evidencias/atlas-indices.png. A visualização registra o estado da interface no momento da conferência; o JSON de verificação guarda os detalhes dos cinco exemplos e dos índices.</w:t>
+        <w:t>Os quatro índices apareceram como READY. Os índices de nome e ANS estão marcados como UNIQUE; o índice convenios_ativos_nome contém ativo e nome em ordem crescente. As capturas dos documentos, filtros e índices estão em evidencias. O arquivo compass-verificacao.json registra os resultados da conferência visual, complementando verificacao-banco.json.</w:t>
       </w:r>
     </w:p>
     <w:p>
@@ -2449,7 +2454,7 @@
     </w:p>
     <w:p>
       <w:r>
-        <w:t>Foi obtido o Compass portátil oficial 1.53.1, com hash conferido e assinatura válida da MongoDB. A tentativa de abrir o aplicativo não apresentou janela controlável. Por isso, esta documentação não registra a conferência nele como concluída. O roteiro para executá-la está em guia-compass.md; a conferência no Atlas e a consulta real pelo Nest foram concluídas.</w:t>
+        <w:t>A conferência foi concluída em 29 de outubro no Compass 1.53.2 aberto neste PC. Foram feitas apenas consultas, sem editar ou excluir documentos. A conexão não foi salva no aplicativo. O guia-compass.md reúne os resultados, as capturas e os passos para repetir a demonstração.</w:t>
       </w:r>
     </w:p>
     <w:p>
@@ -2519,7 +2524,7 @@
         <w:pStyle w:val="ListNumber"/>
       </w:pPr>
       <w:r>
-        <w:t>Execute npm run verificar:convenios e abra clinora.convenios no Atlas. Mostre os cinco registros, as datas e a aba Indexes com os quatro índices.</w:t>
+        <w:t>Execute npm run verificar:convenios e abra clinora.convenios no Compass. Mostre os cinco registros, os filtros de ativo e ANS 045678, as datas e a aba Indexes com os quatro índices READY.</w:t>
       </w:r>
     </w:p>
     <w:p>

</xml_diff>